<commit_message>
add helm and formatting changes
</commit_message>
<xml_diff>
--- a/output/resume.docx
+++ b/output/resume.docx
@@ -82,7 +82,7 @@
         </w:numPr>
       </w:pPr>
       <w:r>
-        <w:t xml:space="preserve">Implemented a complete CI/CD solution for an internal Application from scratch in ConcourseCI.</w:t>
+        <w:t xml:space="preserve">Implemented a complete CI/CD solution for an internal Application from scratch using ConcourseCI.</w:t>
       </w:r>
     </w:p>
     <w:p>
@@ -106,7 +106,7 @@
         </w:numPr>
       </w:pPr>
       <w:r>
-        <w:t xml:space="preserve">Enabled a blockchain initiative from the DevOps perspective.</w:t>
+        <w:t xml:space="preserve">Enabled a blockchain initiative at State Street from the DevOps perspective.</w:t>
       </w:r>
     </w:p>
     <w:p>
@@ -153,7 +153,7 @@
         </w:numPr>
       </w:pPr>
       <w:r>
-        <w:t xml:space="preserve">Helped in Automation of the calabash test suite for a</w:t>
+        <w:t xml:space="preserve">Helped in Automation of the calabash test suite for the</w:t>
       </w:r>
       <w:r>
         <w:t xml:space="preserve"> </w:t>
@@ -170,7 +170,7 @@
         <w:t xml:space="preserve"> </w:t>
       </w:r>
       <w:r>
-        <w:t xml:space="preserve">airline.</w:t>
+        <w:t xml:space="preserve">airlines.</w:t>
       </w:r>
     </w:p>
     <w:p>
@@ -200,7 +200,7 @@
         </w:numPr>
       </w:pPr>
       <w:r>
-        <w:t xml:space="preserve">Enabled a hospitality business in creating a single platform for its franchise brands.</w:t>
+        <w:t xml:space="preserve">Worked a hospitality business in creating their multiple UI’s/single backend platform for its all their franchise brands.</w:t>
       </w:r>
     </w:p>
     <w:p>
@@ -212,7 +212,7 @@
         </w:numPr>
       </w:pPr>
       <w:r>
-        <w:t xml:space="preserve">Worked on an internal platform for an investment bank to manage their Gift and Entertainment services.</w:t>
+        <w:t xml:space="preserve">Worked on an internal platform of an investment bank to manage their Gift and Entertainment services.</w:t>
       </w:r>
     </w:p>
     <w:p>
@@ -224,7 +224,7 @@
         </w:numPr>
       </w:pPr>
       <w:r>
-        <w:t xml:space="preserve">Enabled a first-class blockchain platform</w:t>
+        <w:t xml:space="preserve">Worked and enabled a first-class blockchain platform</w:t>
       </w:r>
       <w:r>
         <w:t xml:space="preserve"> </w:t>
@@ -246,6 +246,18 @@
     </w:p>
     <w:p>
       <w:pPr>
+        <w:pStyle w:val="Compact"/>
+        <w:numPr>
+          <w:numId w:val="1002"/>
+          <w:ilvl w:val="0"/>
+        </w:numPr>
+      </w:pPr>
+      <w:r>
+        <w:t xml:space="preserve">Worked end-to-end on an internal Application [Ramp up] of Thoughworks starting from analysis till deployment.</w:t>
+      </w:r>
+    </w:p>
+    <w:p>
+      <w:pPr>
         <w:pStyle w:val="Heading2"/>
       </w:pPr>
       <w:bookmarkStart w:id="24" w:name="technical-experience"/>
@@ -274,7 +286,7 @@
         <w:t xml:space="preserve"> </w:t>
       </w:r>
       <w:r>
-        <w:t xml:space="preserve">Concourse CI</w:t>
+        <w:t xml:space="preserve">Concourse CI, Jaeger, Git</w:t>
       </w:r>
     </w:p>
     <w:p>
@@ -318,7 +330,7 @@
         <w:t xml:space="preserve"> </w:t>
       </w:r>
       <w:r>
-        <w:t xml:space="preserve">Ruby, Golang, Docker, Kubernetes, TCP/IP stack, Information Security, GOCD.</w:t>
+        <w:t xml:space="preserve">Ruby, Golang, Docker, Kubernetes, Helm, TCP/IP stack, Information Security, GOCD.</w:t>
       </w:r>
     </w:p>
     <w:p>
@@ -336,7 +348,7 @@
         <w:t xml:space="preserve"> </w:t>
       </w:r>
       <w:r>
-        <w:t xml:space="preserve">EFFK Stack, Open Tracing, Jaeger.</w:t>
+        <w:t xml:space="preserve">EFFK Stack, Open Tracing.</w:t>
       </w:r>
     </w:p>
     <w:p>
@@ -354,7 +366,7 @@
         <w:t xml:space="preserve"> </w:t>
       </w:r>
       <w:r>
-        <w:t xml:space="preserve">Git, Data structures, Algorithms</w:t>
+        <w:t xml:space="preserve">Data structures, Algorithms</w:t>
       </w:r>
     </w:p>
     <w:p>

</xml_diff>

<commit_message>
remove java from proficient
</commit_message>
<xml_diff>
--- a/output/resume.docx
+++ b/output/resume.docx
@@ -280,7 +280,7 @@
         <w:pStyle w:val="Definition"/>
       </w:pPr>
       <w:r>
-        <w:t xml:space="preserve">AWS, Java, CI/CD, Observability, Terraform, Linux/Unix, Problem Solving,</w:t>
+        <w:t xml:space="preserve">AWS, CI/CD, Observability, Terraform, Linux/Unix, Problem Solving,</w:t>
       </w:r>
       <w:r>
         <w:t xml:space="preserve"> </w:t>
@@ -330,7 +330,7 @@
         <w:t xml:space="preserve"> </w:t>
       </w:r>
       <w:r>
-        <w:t xml:space="preserve">Ruby, Golang, Docker, Kubernetes, Helm, TCP/IP stack, Information Security, GOCD.</w:t>
+        <w:t xml:space="preserve">Java, Ruby, Golang, Docker, Kubernetes, Helm, TCP/IP stack, Information Security, GOCD.</w:t>
       </w:r>
     </w:p>
     <w:p>

</xml_diff>

<commit_message>
type | move java to backend part
</commit_message>
<xml_diff>
--- a/output/resume.docx
+++ b/output/resume.docx
@@ -312,7 +312,7 @@
         <w:t xml:space="preserve"> </w:t>
       </w:r>
       <w:r>
-        <w:t xml:space="preserve">Ruby on Rails, Spring boot, JUnit, Jasmine, Rspec, Cucumber</w:t>
+        <w:t xml:space="preserve">Java, Ruby on Rails, Spring boot, JUnit, Jasmine, Rspec, Cucumber</w:t>
       </w:r>
     </w:p>
     <w:p>
@@ -330,7 +330,7 @@
         <w:t xml:space="preserve"> </w:t>
       </w:r>
       <w:r>
-        <w:t xml:space="preserve">Java, Ruby, Golang, Docker, Kubernetes, Helm, TCP/IP stack, Information Security, GOCD.</w:t>
+        <w:t xml:space="preserve">Ruby, Golang, Docker, Kubernetes, Helm, TCP/IP stack, Information Security, GOCD.</w:t>
       </w:r>
     </w:p>
     <w:p>

</xml_diff>

<commit_message>
update resume add cert, oracle
</commit_message>
<xml_diff>
--- a/output/resume.docx
+++ b/output/resume.docx
@@ -64,13 +64,30 @@
         <w:rPr>
           <w:b/>
         </w:rPr>
+        <w:t xml:space="preserve">Oracle</w:t>
+      </w:r>
+      <w:r>
+        <w:t xml:space="preserve"> </w:t>
+      </w:r>
+      <w:r>
+        <w:t xml:space="preserve">(Jan 2020 - Working)</w:t>
+      </w:r>
+    </w:p>
+    <w:p>
+      <w:pPr>
+        <w:pStyle w:val="BodyText"/>
+      </w:pPr>
+      <w:r>
+        <w:rPr>
+          <w:b/>
+        </w:rPr>
         <w:t xml:space="preserve">State Street:</w:t>
       </w:r>
       <w:r>
         <w:t xml:space="preserve"> </w:t>
       </w:r>
       <w:r>
-        <w:t xml:space="preserve">(April 2019 - Working)</w:t>
+        <w:t xml:space="preserve">(April 2019 - Dec 2020)</w:t>
       </w:r>
     </w:p>
     <w:p>
@@ -135,7 +152,7 @@
         <w:rPr>
           <w:b/>
         </w:rPr>
-        <w:t xml:space="preserve">ThoughtWorks</w:t>
+        <w:t xml:space="preserve">ThoughtWorks:</w:t>
       </w:r>
       <w:r>
         <w:t xml:space="preserve"> </w:t>
@@ -417,11 +434,67 @@
       <w:pPr>
         <w:pStyle w:val="Heading2"/>
       </w:pPr>
-      <w:bookmarkStart w:id="26" w:name="education"/>
+      <w:bookmarkStart w:id="26" w:name="certifications"/>
+      <w:r>
+        <w:t xml:space="preserve">Certifications</w:t>
+      </w:r>
+      <w:bookmarkEnd w:id="26"/>
+    </w:p>
+    <w:p>
+      <w:pPr>
+        <w:pStyle w:val="DefinitionTerm"/>
+      </w:pPr>
+      <w:r>
+        <w:t xml:space="preserve">2020-2023</w:t>
+      </w:r>
+    </w:p>
+    <w:p>
+      <w:pPr>
+        <w:pStyle w:val="Definition"/>
+      </w:pPr>
+      <w:r>
+        <w:rPr>
+          <w:b/>
+        </w:rPr>
+        <w:t xml:space="preserve">Certified kubernetes Administrator</w:t>
+      </w:r>
+      <w:r>
+        <w:t xml:space="preserve">; Linux Foundation</w:t>
+      </w:r>
+    </w:p>
+    <w:p>
+      <w:pPr>
+        <w:pStyle w:val="Definition"/>
+      </w:pPr>
+      <w:r>
+        <w:rPr>
+          <w:b/>
+        </w:rPr>
+        <w:t xml:space="preserve">Credentials:</w:t>
+      </w:r>
+      <w:r>
+        <w:t xml:space="preserve"> </w:t>
+      </w:r>
+      <w:r>
+        <w:t xml:space="preserve">LF-ipxdcfqgi3</w:t>
+      </w:r>
+    </w:p>
+    <w:p>
+      <w:r>
+        <w:pict>
+          <v:rect style="width:0;height:1.5pt" o:hralign="center" o:hrstd="t" o:hr="t"/>
+        </w:pict>
+      </w:r>
+    </w:p>
+    <w:p>
+      <w:pPr>
+        <w:pStyle w:val="Heading2"/>
+      </w:pPr>
+      <w:bookmarkStart w:id="27" w:name="education"/>
       <w:r>
         <w:t xml:space="preserve">Education</w:t>
       </w:r>
-      <w:bookmarkEnd w:id="26"/>
+      <w:bookmarkEnd w:id="27"/>
     </w:p>
     <w:p>
       <w:pPr>
@@ -496,7 +569,7 @@
       <w:pPr>
         <w:pStyle w:val="BlockText"/>
       </w:pPr>
-      <w:hyperlink r:id="rId27">
+      <w:hyperlink r:id="rId28">
         <w:r>
           <w:rPr>
             <w:rStyle w:val="Hyperlink"/>
@@ -508,7 +581,7 @@
         <w:t xml:space="preserve"> </w:t>
       </w:r>
       <w:r>
-        <w:t xml:space="preserve">• +91-9803972479 • Senior DevOps Engineer</w:t>
+        <w:t xml:space="preserve">• +91-9803972479 • Principal DevOps Engineer</w:t>
       </w:r>
       <w:r>
         <w:br w:type="textWrapping"/>

</xml_diff>

<commit_message>
add oracle and take latest master
</commit_message>
<xml_diff>
--- a/output/resume.docx
+++ b/output/resume.docx
@@ -24,19 +24,19 @@
         <w:pStyle w:val="BlockText"/>
       </w:pPr>
       <w:r>
-        <w:t xml:space="preserve">DevOps specialist with ample experience in financial, trading, and non-profit sectors. Throughout my career, I</w:t>
-      </w:r>
-      <w:r>
-        <w:t xml:space="preserve"> </w:t>
-      </w:r>
-      <w:r>
-        <w:t xml:space="preserve">was privileged to work with skilled people in multiple realms, and elite projects, including Delta Airlines,</w:t>
-      </w:r>
-      <w:r>
-        <w:t xml:space="preserve"> </w:t>
-      </w:r>
-      <w:r>
-        <w:t xml:space="preserve">Football Pools, VAKT, Credit Suisse, et cetera.</w:t>
+        <w:t xml:space="preserve">Certified Kubernetes Administrator, DevOps specialist with ample experience in financial, trading, and non-profit sectors.</w:t>
+      </w:r>
+      <w:r>
+        <w:t xml:space="preserve"> </w:t>
+      </w:r>
+      <w:r>
+        <w:t xml:space="preserve">Throughout my career, I was privileged to work with skilled people in multiple realms, and elite projects,</w:t>
+      </w:r>
+      <w:r>
+        <w:t xml:space="preserve"> </w:t>
+      </w:r>
+      <w:r>
+        <w:t xml:space="preserve">including Delta Airlines, Football Pools, VAKT, Credit Suisse, et cetera.</w:t>
       </w:r>
     </w:p>
     <w:p>
@@ -64,30 +64,28 @@
         <w:rPr>
           <w:b/>
         </w:rPr>
-        <w:t xml:space="preserve">Oracle</w:t>
-      </w:r>
-      <w:r>
-        <w:t xml:space="preserve"> </w:t>
-      </w:r>
-      <w:r>
-        <w:t xml:space="preserve">(Jan 2020 - Working)</w:t>
-      </w:r>
-    </w:p>
-    <w:p>
-      <w:pPr>
-        <w:pStyle w:val="BodyText"/>
-      </w:pPr>
+        <w:t xml:space="preserve">Oracle:</w:t>
+      </w:r>
       <w:r>
         <w:rPr>
           <w:b/>
         </w:rPr>
-        <w:t xml:space="preserve">State Street:</w:t>
-      </w:r>
-      <w:r>
-        <w:t xml:space="preserve"> </w:t>
-      </w:r>
-      <w:r>
-        <w:t xml:space="preserve">(April 2019 - Dec 2020)</w:t>
+        <w:t xml:space="preserve"> </w:t>
+      </w:r>
+      <w:r>
+        <w:t xml:space="preserve"> </w:t>
+      </w:r>
+      <w:r>
+        <w:t xml:space="preserve">(Jan 20 - Working)</w:t>
+      </w:r>
+      <w:r>
+        <w:t xml:space="preserve"> </w:t>
+      </w:r>
+      <w:r>
+        <w:rPr>
+          <w:b/>
+        </w:rPr>
+        <w:t xml:space="preserve">Principal DevOps Engineer</w:t>
       </w:r>
     </w:p>
     <w:p>
@@ -99,7 +97,7 @@
         </w:numPr>
       </w:pPr>
       <w:r>
-        <w:t xml:space="preserve">Implemented a complete CI/CD solution for an internal Application from scratch using ConcourseCI.</w:t>
+        <w:t xml:space="preserve">Leading the CI/CD team for multiple projects.</w:t>
       </w:r>
     </w:p>
     <w:p>
@@ -111,7 +109,7 @@
         </w:numPr>
       </w:pPr>
       <w:r>
-        <w:t xml:space="preserve">Enabled a team in Artefacts management and Deployment on Kubernetes.</w:t>
+        <w:t xml:space="preserve">Active contributer to a backend project creating/configuring resources in the cloud (OCI).</w:t>
       </w:r>
     </w:p>
     <w:p>
@@ -123,14 +121,76 @@
         </w:numPr>
       </w:pPr>
       <w:r>
-        <w:t xml:space="preserve">Enabled a blockchain initiative at State Street from the DevOps perspective.</w:t>
+        <w:t xml:space="preserve">R&amp;D on multiple new initiatives for the Cloud Database team.</w:t>
+      </w:r>
+    </w:p>
+    <w:p>
+      <w:pPr>
+        <w:pStyle w:val="FirstParagraph"/>
+      </w:pPr>
+      <w:r>
+        <w:rPr>
+          <w:b/>
+        </w:rPr>
+        <w:t xml:space="preserve">State Street:</w:t>
+      </w:r>
+      <w:r>
+        <w:t xml:space="preserve"> </w:t>
+      </w:r>
+      <w:r>
+        <w:t xml:space="preserve">(April 2019 - Dec 2020)</w:t>
+      </w:r>
+      <w:r>
+        <w:t xml:space="preserve"> </w:t>
+      </w:r>
+      <w:r>
+        <w:rPr>
+          <w:b/>
+        </w:rPr>
+        <w:t xml:space="preserve">Senior Associate - Assitant Manager</w:t>
       </w:r>
     </w:p>
     <w:p>
       <w:pPr>
         <w:pStyle w:val="Compact"/>
         <w:numPr>
-          <w:numId w:val="1001"/>
+          <w:numId w:val="1002"/>
+          <w:ilvl w:val="0"/>
+        </w:numPr>
+      </w:pPr>
+      <w:r>
+        <w:t xml:space="preserve">Implemented a complete CI/CD solution for an internal Application from scratch using ConcourseCI.</w:t>
+      </w:r>
+    </w:p>
+    <w:p>
+      <w:pPr>
+        <w:pStyle w:val="Compact"/>
+        <w:numPr>
+          <w:numId w:val="1002"/>
+          <w:ilvl w:val="0"/>
+        </w:numPr>
+      </w:pPr>
+      <w:r>
+        <w:t xml:space="preserve">Enabled a team in Artefacts management and Deployment on Kubernetes.</w:t>
+      </w:r>
+    </w:p>
+    <w:p>
+      <w:pPr>
+        <w:pStyle w:val="Compact"/>
+        <w:numPr>
+          <w:numId w:val="1002"/>
+          <w:ilvl w:val="0"/>
+        </w:numPr>
+      </w:pPr>
+      <w:r>
+        <w:t xml:space="preserve">Enabled a blockchain initiative at State Street from the DevOps perspective.</w:t>
+      </w:r>
+    </w:p>
+    <w:p>
+      <w:pPr>
+        <w:pStyle w:val="Compact"/>
+        <w:numPr>
+          <w:numId w:val="1002"/>
           <w:ilvl w:val="0"/>
         </w:numPr>
       </w:pPr>
@@ -160,12 +220,21 @@
       <w:r>
         <w:t xml:space="preserve">(Jan 2015 - April 2019)</w:t>
       </w:r>
+      <w:r>
+        <w:t xml:space="preserve"> </w:t>
+      </w:r>
+      <w:r>
+        <w:rPr>
+          <w:b/>
+        </w:rPr>
+        <w:t xml:space="preserve">Application Developer</w:t>
+      </w:r>
     </w:p>
     <w:p>
       <w:pPr>
         <w:pStyle w:val="Compact"/>
         <w:numPr>
-          <w:numId w:val="1002"/>
+          <w:numId w:val="1003"/>
           <w:ilvl w:val="0"/>
         </w:numPr>
       </w:pPr>
@@ -194,7 +263,7 @@
       <w:pPr>
         <w:pStyle w:val="Compact"/>
         <w:numPr>
-          <w:numId w:val="1002"/>
+          <w:numId w:val="1003"/>
           <w:ilvl w:val="0"/>
         </w:numPr>
       </w:pPr>
@@ -212,7 +281,7 @@
       <w:pPr>
         <w:pStyle w:val="Compact"/>
         <w:numPr>
-          <w:numId w:val="1002"/>
+          <w:numId w:val="1003"/>
           <w:ilvl w:val="0"/>
         </w:numPr>
       </w:pPr>
@@ -224,7 +293,7 @@
       <w:pPr>
         <w:pStyle w:val="Compact"/>
         <w:numPr>
-          <w:numId w:val="1002"/>
+          <w:numId w:val="1003"/>
           <w:ilvl w:val="0"/>
         </w:numPr>
       </w:pPr>
@@ -236,7 +305,7 @@
       <w:pPr>
         <w:pStyle w:val="Compact"/>
         <w:numPr>
-          <w:numId w:val="1002"/>
+          <w:numId w:val="1003"/>
           <w:ilvl w:val="0"/>
         </w:numPr>
       </w:pPr>
@@ -265,7 +334,7 @@
       <w:pPr>
         <w:pStyle w:val="Compact"/>
         <w:numPr>
-          <w:numId w:val="1002"/>
+          <w:numId w:val="1003"/>
           <w:ilvl w:val="0"/>
         </w:numPr>
       </w:pPr>
@@ -297,13 +366,7 @@
         <w:pStyle w:val="Definition"/>
       </w:pPr>
       <w:r>
-        <w:t xml:space="preserve">AWS, CI/CD, Observability, Terraform, Linux/Unix, Problem Solving,</w:t>
-      </w:r>
-      <w:r>
-        <w:t xml:space="preserve"> </w:t>
-      </w:r>
-      <w:r>
-        <w:t xml:space="preserve">Concourse CI, Jaeger, Git</w:t>
+        <w:t xml:space="preserve">Cloud, Kubernetes, CI/CD, Observability, Linux/Unix, Problem Solving, Jaeger, Git</w:t>
       </w:r>
     </w:p>
     <w:p>
@@ -347,7 +410,7 @@
         <w:t xml:space="preserve"> </w:t>
       </w:r>
       <w:r>
-        <w:t xml:space="preserve">Ruby, Golang, Docker, Kubernetes, Helm, TCP/IP stack, Information Security, GOCD.</w:t>
+        <w:t xml:space="preserve">Ruby, Golang, Python, Terraform, Docker, Helm, TCP/IP stack, Information Security, Concourse CI, GOCD.</w:t>
       </w:r>
     </w:p>
     <w:p>
@@ -939,6 +1002,9 @@
     <w:abstractNumId w:val="991"/>
   </w:num>
   <w:num w:numId="1002">
+    <w:abstractNumId w:val="991"/>
+  </w:num>
+  <w:num w:numId="1003">
     <w:abstractNumId w:val="991"/>
   </w:num>
 </w:numbering>

</xml_diff>

<commit_message>
shorten the experience section
</commit_message>
<xml_diff>
--- a/output/resume.docx
+++ b/output/resume.docx
@@ -295,7 +295,7 @@
         <w:pStyle w:val="BodyText"/>
       </w:pPr>
       <w:r>
-        <w:t xml:space="preserve">Tech Stack: kubernetes, AWS, Golang, Vault, Argocd, Spinnaker, Backstage, Terraform, bitbucket pipelines, Helm, Newrelic, CDK, etc.</w:t>
+        <w:t xml:space="preserve">Tech Stack: kubernetes, AWS, Golang, Vault, Argocd, Spinnaker, Backstage, Terraform, bitbucket pipelines, Helm, Newrelic, CDK, keycloak, etc.</w:t>
       </w:r>
     </w:p>
     <w:p>
@@ -480,40 +480,7 @@
         </w:numPr>
       </w:pPr>
       <w:r>
-        <w:t xml:space="preserve">IC on self-hosted GitHub Actions running on AWS Kubernetes cluster (EKS).</w:t>
-      </w:r>
-    </w:p>
-    <w:p>
-      <w:pPr>
-        <w:numPr>
-          <w:ilvl w:val="0"/>
-          <w:numId w:val="1002"/>
-        </w:numPr>
-      </w:pPr>
-      <w:r>
-        <w:t xml:space="preserve">Active support for HelloTech on CICD in general.</w:t>
-      </w:r>
-    </w:p>
-    <w:p>
-      <w:pPr>
-        <w:numPr>
-          <w:ilvl w:val="0"/>
-          <w:numId w:val="1002"/>
-        </w:numPr>
-      </w:pPr>
-      <w:r>
-        <w:t xml:space="preserve">Led the E2E testing initiative for platform related tools and code.</w:t>
-      </w:r>
-    </w:p>
-    <w:p>
-      <w:pPr>
-        <w:numPr>
-          <w:ilvl w:val="0"/>
-          <w:numId w:val="1002"/>
-        </w:numPr>
-      </w:pPr>
-      <w:r>
-        <w:t xml:space="preserve">IC on automating resource provisioning in GitHub using terraform IAC.</w:t>
+        <w:t xml:space="preserve">IC on self-hosted GitHub Actions running on AWS Kubernetes cluster (EKS), active platform support, E2E testing initiative.</w:t>
       </w:r>
     </w:p>
     <w:p>
@@ -530,7 +497,7 @@
         <w:t xml:space="preserve"> </w:t>
       </w:r>
       <w:r>
-        <w:t xml:space="preserve">(Jan 20 - July 22)</w:t>
+        <w:t xml:space="preserve">(Jan 21 - July 22)</w:t>
       </w:r>
       <w:r>
         <w:t xml:space="preserve"> </w:t>
@@ -564,7 +531,19 @@
         </w:numPr>
       </w:pPr>
       <w:r>
-        <w:t xml:space="preserve">Led the CI/CD team for multiple projects.</w:t>
+        <w:t xml:space="preserve">Moved the entire setup of CICD (Exadata DB automation) taking more than</w:t>
+      </w:r>
+      <w:r>
+        <w:t xml:space="preserve"> </w:t>
+      </w:r>
+      <w:r>
+        <w:rPr>
+          <w:b/>
+        </w:rPr>
+        <w:t xml:space="preserve">12 hours to 1/2 hours asynchronous setup</w:t>
+      </w:r>
+      <w:r>
+        <w:t xml:space="preserve">.</w:t>
       </w:r>
     </w:p>
     <w:p>
@@ -575,19 +554,7 @@
         </w:numPr>
       </w:pPr>
       <w:r>
-        <w:t xml:space="preserve">Moved the entire setup of CICD (Exadata DB automation) taking more than</w:t>
-      </w:r>
-      <w:r>
-        <w:t xml:space="preserve"> </w:t>
-      </w:r>
-      <w:r>
-        <w:rPr>
-          <w:b/>
-        </w:rPr>
-        <w:t xml:space="preserve">12 hours to 1/2 hours asynchronous setup</w:t>
-      </w:r>
-      <w:r>
-        <w:t xml:space="preserve">.</w:t>
+        <w:t xml:space="preserve">Automating a comprehensive set of operations in the DB cloud for a faster feedback cycle.</w:t>
       </w:r>
     </w:p>
     <w:p>
@@ -598,7 +565,7 @@
         </w:numPr>
       </w:pPr>
       <w:r>
-        <w:t xml:space="preserve">Automating a comprehensive set of operations in the DB cloud for a faster feedback cycle.</w:t>
+        <w:t xml:space="preserve">IC on a JSON/YAML based input project to provision resources in the cloud (OCI).</w:t>
       </w:r>
     </w:p>
     <w:p>
@@ -609,7 +576,7 @@
         </w:numPr>
       </w:pPr>
       <w:r>
-        <w:t xml:space="preserve">IC on a JSON/YAML based input project to provision resources in the cloud (OCI).</w:t>
+        <w:t xml:space="preserve">Setup framework and onboarded multiple existing/new projects with unit/integration testing.</w:t>
       </w:r>
     </w:p>
     <w:p>
@@ -620,7 +587,7 @@
         </w:numPr>
       </w:pPr>
       <w:r>
-        <w:t xml:space="preserve">Setup framework and onboarded multiple existing/new projects with unit/integration testing.</w:t>
+        <w:t xml:space="preserve">Actively working with security on incident management from the DB cloud team side.</w:t>
       </w:r>
     </w:p>
     <w:p>
@@ -631,7 +598,7 @@
         </w:numPr>
       </w:pPr>
       <w:r>
-        <w:t xml:space="preserve">Actively working with security on incident management from the DB cloud team side.</w:t>
+        <w:t xml:space="preserve">R&amp;D on multiple new initiatives for the Cloud Database team.</w:t>
       </w:r>
     </w:p>
     <w:p>
@@ -642,17 +609,6 @@
         </w:numPr>
       </w:pPr>
       <w:r>
-        <w:t xml:space="preserve">R&amp;D on multiple new initiatives for the Cloud Database team.</w:t>
-      </w:r>
-    </w:p>
-    <w:p>
-      <w:pPr>
-        <w:numPr>
-          <w:ilvl w:val="0"/>
-          <w:numId w:val="1003"/>
-        </w:numPr>
-      </w:pPr>
-      <w:r>
         <w:rPr>
           <w:b/>
         </w:rPr>
@@ -713,46 +669,7 @@
         </w:numPr>
       </w:pPr>
       <w:r>
-        <w:t xml:space="preserve">Implemented a complete CI/CD solution for an internal Application from scratch using ConcourseCI considering developer productivity as the top priority.</w:t>
-      </w:r>
-    </w:p>
-    <w:p>
-      <w:pPr>
-        <w:numPr>
-          <w:ilvl w:val="0"/>
-          <w:numId w:val="1004"/>
-        </w:numPr>
-      </w:pPr>
-      <w:r>
-        <w:t xml:space="preserve">Enabled a team in Artefacts management and Deployment on Kubernetes with sandbox environments for a faster feedback cycle.</w:t>
-      </w:r>
-    </w:p>
-    <w:p>
-      <w:pPr>
-        <w:numPr>
-          <w:ilvl w:val="0"/>
-          <w:numId w:val="1004"/>
-        </w:numPr>
-      </w:pPr>
-      <w:r>
-        <w:t xml:space="preserve">Enabled a blockchain initiative at State Street from the DevOps perspective.</w:t>
-      </w:r>
-    </w:p>
-    <w:p>
-      <w:pPr>
-        <w:numPr>
-          <w:ilvl w:val="0"/>
-          <w:numId w:val="1004"/>
-        </w:numPr>
-      </w:pPr>
-      <w:r>
-        <w:t xml:space="preserve">Implemented an Enterprise level observability stack including EFK, and Open Tracing running on</w:t>
-      </w:r>
-      <w:r>
-        <w:t xml:space="preserve"> </w:t>
-      </w:r>
-      <w:r>
-        <w:t xml:space="preserve">Kubernetes.</w:t>
+        <w:t xml:space="preserve">Led the team for CICD setup from scratch, ELK stack on Kubernetes, and IC on a blockchain initiative.</w:t>
       </w:r>
     </w:p>
     <w:p>
@@ -803,79 +720,12 @@
         </w:numPr>
       </w:pPr>
       <w:r>
-        <w:t xml:space="preserve">Helped in the automation of the calabash test suite for</w:t>
+        <w:t xml:space="preserve">Tech consulting for multiple clients including Delta](https://www.thoughtworks.com/clients/delta) airlines,</w:t>
       </w:r>
       <w:r>
         <w:t xml:space="preserve"> </w:t>
       </w:r>
       <w:hyperlink r:id="rId24">
-        <w:r>
-          <w:rPr>
-            <w:rStyle w:val="Hyperlink"/>
-          </w:rPr>
-          <w:t xml:space="preserve">Delta</w:t>
-        </w:r>
-      </w:hyperlink>
-      <w:r>
-        <w:t xml:space="preserve"> </w:t>
-      </w:r>
-      <w:r>
-        <w:t xml:space="preserve">airlines.</w:t>
-      </w:r>
-    </w:p>
-    <w:p>
-      <w:pPr>
-        <w:numPr>
-          <w:ilvl w:val="0"/>
-          <w:numId w:val="1005"/>
-        </w:numPr>
-      </w:pPr>
-      <w:r>
-        <w:t xml:space="preserve">Worked on a betting platform product with ~25 micro-services written in Ruby on Rails deployed</w:t>
-      </w:r>
-      <w:r>
-        <w:t xml:space="preserve"> </w:t>
-      </w:r>
-      <w:r>
-        <w:t xml:space="preserve">using Vagrant and Puppet.</w:t>
-      </w:r>
-    </w:p>
-    <w:p>
-      <w:pPr>
-        <w:numPr>
-          <w:ilvl w:val="0"/>
-          <w:numId w:val="1005"/>
-        </w:numPr>
-      </w:pPr>
-      <w:r>
-        <w:t xml:space="preserve">Worked on a hospitality business in creating multiple UI’s/single backend platform for all their franchise brands.</w:t>
-      </w:r>
-    </w:p>
-    <w:p>
-      <w:pPr>
-        <w:numPr>
-          <w:ilvl w:val="0"/>
-          <w:numId w:val="1005"/>
-        </w:numPr>
-      </w:pPr>
-      <w:r>
-        <w:t xml:space="preserve">Worked on an internal platform of an investment bank to manage their Gift and Entertainment Services.</w:t>
-      </w:r>
-    </w:p>
-    <w:p>
-      <w:pPr>
-        <w:numPr>
-          <w:ilvl w:val="0"/>
-          <w:numId w:val="1005"/>
-        </w:numPr>
-      </w:pPr>
-      <w:r>
-        <w:t xml:space="preserve">Worked and enabled a first-class blockchain platform</w:t>
-      </w:r>
-      <w:r>
-        <w:t xml:space="preserve"> </w:t>
-      </w:r>
-      <w:hyperlink r:id="rId25">
         <w:r>
           <w:rPr>
             <w:rStyle w:val="Hyperlink"/>
@@ -884,21 +734,7 @@
         </w:r>
       </w:hyperlink>
       <w:r>
-        <w:t xml:space="preserve"> </w:t>
-      </w:r>
-      <w:r>
-        <w:t xml:space="preserve">from the DevOps side.</w:t>
-      </w:r>
-    </w:p>
-    <w:p>
-      <w:pPr>
-        <w:numPr>
-          <w:ilvl w:val="0"/>
-          <w:numId w:val="1005"/>
-        </w:numPr>
-      </w:pPr>
-      <w:r>
-        <w:t xml:space="preserve">Worked end-to-end on an internal Application [Ramp up] of Thoughworks starting from analysis till deployment.</w:t>
+        <w:t xml:space="preserve">, Credit suisse, and football pools, etc.</w:t>
       </w:r>
     </w:p>
     <w:p>
@@ -912,11 +748,11 @@
       <w:pPr>
         <w:pStyle w:val="Heading2"/>
       </w:pPr>
-      <w:bookmarkStart w:id="26" w:name="certifications"/>
+      <w:bookmarkStart w:id="25" w:name="certifications"/>
       <w:r>
         <w:t xml:space="preserve">Certifications</w:t>
       </w:r>
-      <w:bookmarkEnd w:id="26"/>
+      <w:bookmarkEnd w:id="25"/>
     </w:p>
     <w:p>
       <w:pPr>
@@ -968,11 +804,11 @@
       <w:pPr>
         <w:pStyle w:val="Heading2"/>
       </w:pPr>
-      <w:bookmarkStart w:id="27" w:name="references-recommendations"/>
+      <w:bookmarkStart w:id="26" w:name="references-recommendations"/>
       <w:r>
         <w:t xml:space="preserve">References &amp; Recommendations</w:t>
       </w:r>
-      <w:bookmarkEnd w:id="27"/>
+      <w:bookmarkEnd w:id="26"/>
     </w:p>
     <w:p>
       <w:pPr>
@@ -984,7 +820,7 @@
       <w:r>
         <w:t xml:space="preserve"> </w:t>
       </w:r>
-      <w:hyperlink r:id="rId28">
+      <w:hyperlink r:id="rId27">
         <w:r>
           <w:rPr>
             <w:rStyle w:val="Hyperlink"/>
@@ -1010,11 +846,11 @@
       <w:pPr>
         <w:pStyle w:val="Heading2"/>
       </w:pPr>
-      <w:bookmarkStart w:id="29" w:name="education"/>
+      <w:bookmarkStart w:id="28" w:name="education"/>
       <w:r>
         <w:t xml:space="preserve">Education</w:t>
       </w:r>
-      <w:bookmarkEnd w:id="29"/>
+      <w:bookmarkEnd w:id="28"/>
     </w:p>
     <w:p>
       <w:pPr>
@@ -1088,7 +924,7 @@
       <w:pPr>
         <w:pStyle w:val="BlockText"/>
       </w:pPr>
-      <w:hyperlink r:id="rId30">
+      <w:hyperlink r:id="rId29">
         <w:r>
           <w:rPr>
             <w:rStyle w:val="Hyperlink"/>

</xml_diff>

<commit_message>
add kuberentes to descriptiom
</commit_message>
<xml_diff>
--- a/output/resume.docx
+++ b/output/resume.docx
@@ -332,7 +332,7 @@
         </w:numPr>
       </w:pPr>
       <w:r>
-        <w:t xml:space="preserve">Led fixing and redesigning internal ephemeral environment creation tool (Bundler) from</w:t>
+        <w:t xml:space="preserve">Led fixing and redesigning internal ephemeral environment creation on kubernetes tool from</w:t>
       </w:r>
       <w:r>
         <w:t xml:space="preserve"> </w:t>
@@ -720,12 +720,29 @@
         </w:numPr>
       </w:pPr>
       <w:r>
-        <w:t xml:space="preserve">Tech consulting for multiple clients including Delta](https://www.thoughtworks.com/clients/delta) airlines,</w:t>
+        <w:t xml:space="preserve">Tech consulting for multiple clients including</w:t>
       </w:r>
       <w:r>
         <w:t xml:space="preserve"> </w:t>
       </w:r>
       <w:hyperlink r:id="rId24">
+        <w:r>
+          <w:rPr>
+            <w:rStyle w:val="Hyperlink"/>
+          </w:rPr>
+          <w:t xml:space="preserve">Delta</w:t>
+        </w:r>
+      </w:hyperlink>
+      <w:r>
+        <w:t xml:space="preserve"> </w:t>
+      </w:r>
+      <w:r>
+        <w:t xml:space="preserve">airlines,</w:t>
+      </w:r>
+      <w:r>
+        <w:t xml:space="preserve"> </w:t>
+      </w:r>
+      <w:hyperlink r:id="rId25">
         <w:r>
           <w:rPr>
             <w:rStyle w:val="Hyperlink"/>
@@ -748,11 +765,11 @@
       <w:pPr>
         <w:pStyle w:val="Heading2"/>
       </w:pPr>
-      <w:bookmarkStart w:id="25" w:name="certifications"/>
+      <w:bookmarkStart w:id="26" w:name="certifications"/>
       <w:r>
         <w:t xml:space="preserve">Certifications</w:t>
       </w:r>
-      <w:bookmarkEnd w:id="25"/>
+      <w:bookmarkEnd w:id="26"/>
     </w:p>
     <w:p>
       <w:pPr>
@@ -804,11 +821,11 @@
       <w:pPr>
         <w:pStyle w:val="Heading2"/>
       </w:pPr>
-      <w:bookmarkStart w:id="26" w:name="references-recommendations"/>
+      <w:bookmarkStart w:id="27" w:name="references-recommendations"/>
       <w:r>
         <w:t xml:space="preserve">References &amp; Recommendations</w:t>
       </w:r>
-      <w:bookmarkEnd w:id="26"/>
+      <w:bookmarkEnd w:id="27"/>
     </w:p>
     <w:p>
       <w:pPr>
@@ -820,7 +837,7 @@
       <w:r>
         <w:t xml:space="preserve"> </w:t>
       </w:r>
-      <w:hyperlink r:id="rId27">
+      <w:hyperlink r:id="rId28">
         <w:r>
           <w:rPr>
             <w:rStyle w:val="Hyperlink"/>
@@ -846,11 +863,11 @@
       <w:pPr>
         <w:pStyle w:val="Heading2"/>
       </w:pPr>
-      <w:bookmarkStart w:id="28" w:name="education"/>
+      <w:bookmarkStart w:id="29" w:name="education"/>
       <w:r>
         <w:t xml:space="preserve">Education</w:t>
       </w:r>
-      <w:bookmarkEnd w:id="28"/>
+      <w:bookmarkEnd w:id="29"/>
     </w:p>
     <w:p>
       <w:pPr>
@@ -924,7 +941,7 @@
       <w:pPr>
         <w:pStyle w:val="BlockText"/>
       </w:pPr>
-      <w:hyperlink r:id="rId29">
+      <w:hyperlink r:id="rId30">
         <w:r>
           <w:rPr>
             <w:rStyle w:val="Hyperlink"/>

</xml_diff>

<commit_message>
add cost reduction in resume
</commit_message>
<xml_diff>
--- a/output/resume.docx
+++ b/output/resume.docx
@@ -33,7 +33,7 @@
         <w:rPr>
           <w:b/>
         </w:rPr>
-        <w:t xml:space="preserve">9+ years of</w:t>
+        <w:t xml:space="preserve">~10 years of</w:t>
       </w:r>
       <w:r>
         <w:t xml:space="preserve"> </w:t>
@@ -200,48 +200,6 @@
       </w:r>
     </w:p>
     <w:p>
-      <w:pPr>
-        <w:pStyle w:val="DefinitionTerm"/>
-      </w:pPr>
-      <w:r>
-        <w:t xml:space="preserve">Open Source</w:t>
-      </w:r>
-    </w:p>
-    <w:p>
-      <w:pPr>
-        <w:pStyle w:val="Definition"/>
-      </w:pPr>
-      <w:r>
-        <w:t xml:space="preserve">Please visit my</w:t>
-      </w:r>
-      <w:r>
-        <w:t xml:space="preserve"> </w:t>
-      </w:r>
-      <w:hyperlink r:id="rId22">
-        <w:r>
-          <w:rPr>
-            <w:rStyle w:val="Hyperlink"/>
-          </w:rPr>
-          <w:t xml:space="preserve">GitHub</w:t>
-        </w:r>
-      </w:hyperlink>
-      <w:r>
-        <w:t xml:space="preserve"> </w:t>
-      </w:r>
-      <w:r>
-        <w:t xml:space="preserve">profile for my side projects, and</w:t>
-      </w:r>
-      <w:r>
-        <w:br/>
-      </w:r>
-      <w:r>
-        <w:rPr>
-          <w:b/>
-        </w:rPr>
-        <w:t xml:space="preserve">Open Source contributions</w:t>
-      </w:r>
-    </w:p>
-    <w:p>
       <w:r>
         <w:pict>
           <v:rect style="width:0;height:1.5pt" o:hralign="center" o:hrstd="t" o:hr="t"/>
@@ -252,11 +210,11 @@
       <w:pPr>
         <w:pStyle w:val="Heading2"/>
       </w:pPr>
-      <w:bookmarkStart w:id="23" w:name="experience"/>
+      <w:bookmarkStart w:id="22" w:name="experience"/>
       <w:r>
         <w:t xml:space="preserve">Experience</w:t>
       </w:r>
-      <w:bookmarkEnd w:id="23"/>
+      <w:bookmarkEnd w:id="22"/>
     </w:p>
     <w:p>
       <w:pPr>
@@ -266,13 +224,30 @@
         <w:rPr>
           <w:b/>
         </w:rPr>
+        <w:t xml:space="preserve">Career Break:</w:t>
+      </w:r>
+      <w:r>
+        <w:t xml:space="preserve"> </w:t>
+      </w:r>
+      <w:r>
+        <w:t xml:space="preserve">(August 24 - ) (Bangalore, India)</w:t>
+      </w:r>
+    </w:p>
+    <w:p>
+      <w:pPr>
+        <w:pStyle w:val="BodyText"/>
+      </w:pPr>
+      <w:r>
+        <w:rPr>
+          <w:b/>
+        </w:rPr>
         <w:t xml:space="preserve">Getir:</w:t>
       </w:r>
       <w:r>
         <w:t xml:space="preserve"> </w:t>
       </w:r>
       <w:r>
-        <w:t xml:space="preserve">(Mar 23 - Working)</w:t>
+        <w:t xml:space="preserve">(Mar 23 - July 24)</w:t>
       </w:r>
       <w:r>
         <w:t xml:space="preserve"> </w:t>
@@ -355,7 +330,25 @@
         <w:t xml:space="preserve">1+ hour to 10 minutes</w:t>
       </w:r>
       <w:r>
-        <w:t xml:space="preserve">.</w:t>
+        <w:t xml:space="preserve"> </w:t>
+      </w:r>
+      <w:r>
+        <w:t xml:space="preserve">saving</w:t>
+      </w:r>
+      <w:r>
+        <w:t xml:space="preserve"> </w:t>
+      </w:r>
+      <w:r>
+        <w:rPr>
+          <w:b/>
+        </w:rPr>
+        <w:t xml:space="preserve">~93.5%</w:t>
+      </w:r>
+      <w:r>
+        <w:t xml:space="preserve"> </w:t>
+      </w:r>
+      <w:r>
+        <w:t xml:space="preserve">in cost.</w:t>
       </w:r>
     </w:p>
     <w:p>
@@ -440,28 +433,28 @@
         <w:rPr>
           <w:b/>
         </w:rPr>
-        <w:t xml:space="preserve">HelloFresh:</w:t>
-      </w:r>
-      <w:r>
-        <w:t xml:space="preserve"> </w:t>
-      </w:r>
-      <w:r>
-        <w:t xml:space="preserve">(Sept 22 - Feb 23)</w:t>
-      </w:r>
-      <w:r>
-        <w:t xml:space="preserve"> </w:t>
-      </w:r>
-      <w:r>
-        <w:rPr>
-          <w:b/>
-        </w:rPr>
-        <w:t xml:space="preserve">Senior Platform Engineer</w:t>
-      </w:r>
-      <w:r>
-        <w:t xml:space="preserve"> </w:t>
-      </w:r>
-      <w:r>
-        <w:t xml:space="preserve">(Berlin, Germany)</w:t>
+        <w:t xml:space="preserve">Oracle:</w:t>
+      </w:r>
+      <w:r>
+        <w:t xml:space="preserve"> </w:t>
+      </w:r>
+      <w:r>
+        <w:t xml:space="preserve">(Jan 21 - July 22)</w:t>
+      </w:r>
+      <w:r>
+        <w:t xml:space="preserve"> </w:t>
+      </w:r>
+      <w:r>
+        <w:rPr>
+          <w:b/>
+        </w:rPr>
+        <w:t xml:space="preserve">Principal DevOps Engineer</w:t>
+      </w:r>
+      <w:r>
+        <w:t xml:space="preserve"> </w:t>
+      </w:r>
+      <w:r>
+        <w:t xml:space="preserve">(Bangalore, India)</w:t>
       </w:r>
     </w:p>
     <w:p>
@@ -469,7 +462,7 @@
         <w:pStyle w:val="BodyText"/>
       </w:pPr>
       <w:r>
-        <w:t xml:space="preserve">Tech Stack: kubernetes, AWS, Golang, Vault,Terraform, Github actions, Prometheus, etc.</w:t>
+        <w:t xml:space="preserve">Tech Stack: OCI, python, Terraform, Jenkins, Internal CICD and monitoring tools, etc.</w:t>
       </w:r>
     </w:p>
     <w:p>
@@ -480,7 +473,112 @@
         </w:numPr>
       </w:pPr>
       <w:r>
-        <w:t xml:space="preserve">IC on self-hosted GitHub Actions running on AWS Kubernetes cluster (EKS), active platform support, E2E testing initiative.</w:t>
+        <w:t xml:space="preserve">Moved the entire setup of CICD (Exadata DB automation) taking more than</w:t>
+      </w:r>
+      <w:r>
+        <w:t xml:space="preserve"> </w:t>
+      </w:r>
+      <w:r>
+        <w:rPr>
+          <w:b/>
+        </w:rPr>
+        <w:t xml:space="preserve">12 hours to 1/2 hours asynchronous setup</w:t>
+      </w:r>
+      <w:r>
+        <w:t xml:space="preserve"> </w:t>
+      </w:r>
+      <w:r>
+        <w:t xml:space="preserve">saving</w:t>
+      </w:r>
+      <w:r>
+        <w:t xml:space="preserve"> </w:t>
+      </w:r>
+      <w:r>
+        <w:rPr>
+          <w:b/>
+        </w:rPr>
+        <w:t xml:space="preserve">~20k USD or 93.5%</w:t>
+      </w:r>
+      <w:r>
+        <w:t xml:space="preserve"> </w:t>
+      </w:r>
+      <w:r>
+        <w:t xml:space="preserve">each execution.</w:t>
+      </w:r>
+    </w:p>
+    <w:p>
+      <w:pPr>
+        <w:numPr>
+          <w:ilvl w:val="0"/>
+          <w:numId w:val="1002"/>
+        </w:numPr>
+      </w:pPr>
+      <w:r>
+        <w:t xml:space="preserve">Automating a comprehensive set of operations in the DB cloud for a faster feedback cycle.</w:t>
+      </w:r>
+    </w:p>
+    <w:p>
+      <w:pPr>
+        <w:numPr>
+          <w:ilvl w:val="0"/>
+          <w:numId w:val="1002"/>
+        </w:numPr>
+      </w:pPr>
+      <w:r>
+        <w:t xml:space="preserve">IC on a JSON/YAML based input project to provision resources in the cloud (OCI).</w:t>
+      </w:r>
+    </w:p>
+    <w:p>
+      <w:pPr>
+        <w:numPr>
+          <w:ilvl w:val="0"/>
+          <w:numId w:val="1002"/>
+        </w:numPr>
+      </w:pPr>
+      <w:r>
+        <w:t xml:space="preserve">Setup framework and onboarded multiple existing/new projects with unit/integration testing.</w:t>
+      </w:r>
+    </w:p>
+    <w:p>
+      <w:pPr>
+        <w:numPr>
+          <w:ilvl w:val="0"/>
+          <w:numId w:val="1002"/>
+        </w:numPr>
+      </w:pPr>
+      <w:r>
+        <w:t xml:space="preserve">Actively working with security on incident management from the DB cloud team side.</w:t>
+      </w:r>
+    </w:p>
+    <w:p>
+      <w:pPr>
+        <w:numPr>
+          <w:ilvl w:val="0"/>
+          <w:numId w:val="1002"/>
+        </w:numPr>
+      </w:pPr>
+      <w:r>
+        <w:t xml:space="preserve">R&amp;D on multiple new initiatives for the Cloud Database team.</w:t>
+      </w:r>
+    </w:p>
+    <w:p>
+      <w:pPr>
+        <w:numPr>
+          <w:ilvl w:val="0"/>
+          <w:numId w:val="1002"/>
+        </w:numPr>
+      </w:pPr>
+      <w:r>
+        <w:rPr>
+          <w:b/>
+        </w:rPr>
+        <w:t xml:space="preserve">Mentor</w:t>
+      </w:r>
+      <w:r>
+        <w:t xml:space="preserve"> </w:t>
+      </w:r>
+      <w:r>
+        <w:t xml:space="preserve">to junior/mid-level level engineers.</w:t>
       </w:r>
     </w:p>
     <w:p>
@@ -491,22 +589,22 @@
         <w:rPr>
           <w:b/>
         </w:rPr>
-        <w:t xml:space="preserve">Oracle:</w:t>
-      </w:r>
-      <w:r>
-        <w:t xml:space="preserve"> </w:t>
-      </w:r>
-      <w:r>
-        <w:t xml:space="preserve">(Jan 21 - July 22)</w:t>
-      </w:r>
-      <w:r>
-        <w:t xml:space="preserve"> </w:t>
-      </w:r>
-      <w:r>
-        <w:rPr>
-          <w:b/>
-        </w:rPr>
-        <w:t xml:space="preserve">Principal DevOps Engineer</w:t>
+        <w:t xml:space="preserve">State Street:</w:t>
+      </w:r>
+      <w:r>
+        <w:t xml:space="preserve"> </w:t>
+      </w:r>
+      <w:r>
+        <w:t xml:space="preserve">(April 2019 - Dec 2020)</w:t>
+      </w:r>
+      <w:r>
+        <w:t xml:space="preserve"> </w:t>
+      </w:r>
+      <w:r>
+        <w:rPr>
+          <w:b/>
+        </w:rPr>
+        <w:t xml:space="preserve">Senior Associate - Assistant Manager</w:t>
       </w:r>
       <w:r>
         <w:t xml:space="preserve"> </w:t>
@@ -520,7 +618,7 @@
         <w:pStyle w:val="BodyText"/>
       </w:pPr>
       <w:r>
-        <w:t xml:space="preserve">Tech Stack: OCI, python, Terraform, Jenkins, Internal CICD and monitoring tools, etc.</w:t>
+        <w:t xml:space="preserve">Tech Stack: kubernetes, AWS, Golang, Concourse, Internal CD tools, etc.</w:t>
       </w:r>
     </w:p>
     <w:p>
@@ -531,94 +629,7 @@
         </w:numPr>
       </w:pPr>
       <w:r>
-        <w:t xml:space="preserve">Moved the entire setup of CICD (Exadata DB automation) taking more than</w:t>
-      </w:r>
-      <w:r>
-        <w:t xml:space="preserve"> </w:t>
-      </w:r>
-      <w:r>
-        <w:rPr>
-          <w:b/>
-        </w:rPr>
-        <w:t xml:space="preserve">12 hours to 1/2 hours asynchronous setup</w:t>
-      </w:r>
-      <w:r>
-        <w:t xml:space="preserve">.</w:t>
-      </w:r>
-    </w:p>
-    <w:p>
-      <w:pPr>
-        <w:numPr>
-          <w:ilvl w:val="0"/>
-          <w:numId w:val="1003"/>
-        </w:numPr>
-      </w:pPr>
-      <w:r>
-        <w:t xml:space="preserve">Automating a comprehensive set of operations in the DB cloud for a faster feedback cycle.</w:t>
-      </w:r>
-    </w:p>
-    <w:p>
-      <w:pPr>
-        <w:numPr>
-          <w:ilvl w:val="0"/>
-          <w:numId w:val="1003"/>
-        </w:numPr>
-      </w:pPr>
-      <w:r>
-        <w:t xml:space="preserve">IC on a JSON/YAML based input project to provision resources in the cloud (OCI).</w:t>
-      </w:r>
-    </w:p>
-    <w:p>
-      <w:pPr>
-        <w:numPr>
-          <w:ilvl w:val="0"/>
-          <w:numId w:val="1003"/>
-        </w:numPr>
-      </w:pPr>
-      <w:r>
-        <w:t xml:space="preserve">Setup framework and onboarded multiple existing/new projects with unit/integration testing.</w:t>
-      </w:r>
-    </w:p>
-    <w:p>
-      <w:pPr>
-        <w:numPr>
-          <w:ilvl w:val="0"/>
-          <w:numId w:val="1003"/>
-        </w:numPr>
-      </w:pPr>
-      <w:r>
-        <w:t xml:space="preserve">Actively working with security on incident management from the DB cloud team side.</w:t>
-      </w:r>
-    </w:p>
-    <w:p>
-      <w:pPr>
-        <w:numPr>
-          <w:ilvl w:val="0"/>
-          <w:numId w:val="1003"/>
-        </w:numPr>
-      </w:pPr>
-      <w:r>
-        <w:t xml:space="preserve">R&amp;D on multiple new initiatives for the Cloud Database team.</w:t>
-      </w:r>
-    </w:p>
-    <w:p>
-      <w:pPr>
-        <w:numPr>
-          <w:ilvl w:val="0"/>
-          <w:numId w:val="1003"/>
-        </w:numPr>
-      </w:pPr>
-      <w:r>
-        <w:rPr>
-          <w:b/>
-        </w:rPr>
-        <w:t xml:space="preserve">Mentor</w:t>
-      </w:r>
-      <w:r>
-        <w:t xml:space="preserve"> </w:t>
-      </w:r>
-      <w:r>
-        <w:t xml:space="preserve">to junior/mid-level level engineers.</w:t>
+        <w:t xml:space="preserve">Led the team for CICD setup from scratch, ELK stack on Kubernetes, and IC on a blockchain initiative.</w:t>
       </w:r>
     </w:p>
     <w:p>
@@ -629,28 +640,28 @@
         <w:rPr>
           <w:b/>
         </w:rPr>
-        <w:t xml:space="preserve">State Street:</w:t>
-      </w:r>
-      <w:r>
-        <w:t xml:space="preserve"> </w:t>
-      </w:r>
-      <w:r>
-        <w:t xml:space="preserve">(April 2019 - Dec 2020)</w:t>
-      </w:r>
-      <w:r>
-        <w:t xml:space="preserve"> </w:t>
-      </w:r>
-      <w:r>
-        <w:rPr>
-          <w:b/>
-        </w:rPr>
-        <w:t xml:space="preserve">Senior Associate - Assistant Manager</w:t>
-      </w:r>
-      <w:r>
-        <w:t xml:space="preserve"> </w:t>
-      </w:r>
-      <w:r>
-        <w:t xml:space="preserve">(Bangalore, India)</w:t>
+        <w:t xml:space="preserve">ThoughtWorks:</w:t>
+      </w:r>
+      <w:r>
+        <w:t xml:space="preserve"> </w:t>
+      </w:r>
+      <w:r>
+        <w:t xml:space="preserve">(Jan 2015 - April 2019)</w:t>
+      </w:r>
+      <w:r>
+        <w:t xml:space="preserve"> </w:t>
+      </w:r>
+      <w:r>
+        <w:rPr>
+          <w:b/>
+        </w:rPr>
+        <w:t xml:space="preserve">Application Developer</w:t>
+      </w:r>
+      <w:r>
+        <w:t xml:space="preserve"> </w:t>
+      </w:r>
+      <w:r>
+        <w:t xml:space="preserve">(Gurugram, India)</w:t>
       </w:r>
     </w:p>
     <w:p>
@@ -658,7 +669,7 @@
         <w:pStyle w:val="BodyText"/>
       </w:pPr>
       <w:r>
-        <w:t xml:space="preserve">Tech Stack: kubernetes, AWS, Golang, Concourse, Internal CD tools, etc.</w:t>
+        <w:t xml:space="preserve">Tech Stack: kubernetes, AWS, Java, Spring boot, Ruby on rails, GOCD, Concourse, Terraform, ELK, Prometheus etc.</w:t>
       </w:r>
     </w:p>
     <w:p>
@@ -669,63 +680,12 @@
         </w:numPr>
       </w:pPr>
       <w:r>
-        <w:t xml:space="preserve">Led the team for CICD setup from scratch, ELK stack on Kubernetes, and IC on a blockchain initiative.</w:t>
-      </w:r>
-    </w:p>
-    <w:p>
-      <w:pPr>
-        <w:pStyle w:val="FirstParagraph"/>
-      </w:pPr>
-      <w:r>
-        <w:rPr>
-          <w:b/>
-        </w:rPr>
-        <w:t xml:space="preserve">ThoughtWorks:</w:t>
-      </w:r>
-      <w:r>
-        <w:t xml:space="preserve"> </w:t>
-      </w:r>
-      <w:r>
-        <w:t xml:space="preserve">(Jan 2015 - April 2019)</w:t>
-      </w:r>
-      <w:r>
-        <w:t xml:space="preserve"> </w:t>
-      </w:r>
-      <w:r>
-        <w:rPr>
-          <w:b/>
-        </w:rPr>
-        <w:t xml:space="preserve">Application Developer</w:t>
-      </w:r>
-      <w:r>
-        <w:t xml:space="preserve"> </w:t>
-      </w:r>
-      <w:r>
-        <w:t xml:space="preserve">(Gurugram, India)</w:t>
-      </w:r>
-    </w:p>
-    <w:p>
-      <w:pPr>
-        <w:pStyle w:val="BodyText"/>
-      </w:pPr>
-      <w:r>
-        <w:t xml:space="preserve">Tech Stack: kubernetes, AWS, Java, Spring boot, Ruby on rails, GOCD, Concourse, Terraform, ELK, Prometheus etc.</w:t>
-      </w:r>
-    </w:p>
-    <w:p>
-      <w:pPr>
-        <w:numPr>
-          <w:ilvl w:val="0"/>
-          <w:numId w:val="1005"/>
-        </w:numPr>
-      </w:pPr>
-      <w:r>
         <w:t xml:space="preserve">Tech consulting for multiple clients including</w:t>
       </w:r>
       <w:r>
         <w:t xml:space="preserve"> </w:t>
       </w:r>
-      <w:hyperlink r:id="rId24">
+      <w:hyperlink r:id="rId23">
         <w:r>
           <w:rPr>
             <w:rStyle w:val="Hyperlink"/>
@@ -742,7 +702,7 @@
       <w:r>
         <w:t xml:space="preserve"> </w:t>
       </w:r>
-      <w:hyperlink r:id="rId25">
+      <w:hyperlink r:id="rId24">
         <w:r>
           <w:rPr>
             <w:rStyle w:val="Hyperlink"/>
@@ -765,11 +725,11 @@
       <w:pPr>
         <w:pStyle w:val="Heading2"/>
       </w:pPr>
-      <w:bookmarkStart w:id="26" w:name="certifications"/>
+      <w:bookmarkStart w:id="25" w:name="certifications"/>
       <w:r>
         <w:t xml:space="preserve">Certifications</w:t>
       </w:r>
-      <w:bookmarkEnd w:id="26"/>
+      <w:bookmarkEnd w:id="25"/>
     </w:p>
     <w:p>
       <w:pPr>
@@ -821,11 +781,11 @@
       <w:pPr>
         <w:pStyle w:val="Heading2"/>
       </w:pPr>
-      <w:bookmarkStart w:id="27" w:name="references-recommendations"/>
+      <w:bookmarkStart w:id="26" w:name="references-recommendations"/>
       <w:r>
         <w:t xml:space="preserve">References &amp; Recommendations</w:t>
       </w:r>
-      <w:bookmarkEnd w:id="27"/>
+      <w:bookmarkEnd w:id="26"/>
     </w:p>
     <w:p>
       <w:pPr>
@@ -837,7 +797,7 @@
       <w:r>
         <w:t xml:space="preserve"> </w:t>
       </w:r>
-      <w:hyperlink r:id="rId28">
+      <w:hyperlink r:id="rId27">
         <w:r>
           <w:rPr>
             <w:rStyle w:val="Hyperlink"/>
@@ -863,11 +823,11 @@
       <w:pPr>
         <w:pStyle w:val="Heading2"/>
       </w:pPr>
-      <w:bookmarkStart w:id="29" w:name="education"/>
+      <w:bookmarkStart w:id="28" w:name="education"/>
       <w:r>
         <w:t xml:space="preserve">Education</w:t>
       </w:r>
-      <w:bookmarkEnd w:id="29"/>
+      <w:bookmarkEnd w:id="28"/>
     </w:p>
     <w:p>
       <w:pPr>
@@ -941,7 +901,7 @@
       <w:pPr>
         <w:pStyle w:val="BlockText"/>
       </w:pPr>
-      <w:hyperlink r:id="rId30">
+      <w:hyperlink r:id="rId29">
         <w:r>
           <w:rPr>
             <w:rStyle w:val="Hyperlink"/>
@@ -953,13 +913,13 @@
         <w:t xml:space="preserve"> </w:t>
       </w:r>
       <w:r>
-        <w:t xml:space="preserve">• +49-17685398154 • Senior Platform Engineer</w:t>
+        <w:t xml:space="preserve">• +91-9803972479 • Senior Platform Engineer</w:t>
       </w:r>
       <w:r>
         <w:br/>
       </w:r>
       <w:r>
-        <w:t xml:space="preserve">Berlin, Germany</w:t>
+        <w:t xml:space="preserve">Bangalore, India</w:t>
       </w:r>
     </w:p>
     <w:sectPr/>
@@ -1211,9 +1171,6 @@
     <w:abstractNumId w:val="991"/>
   </w:num>
   <w:num w:numId="1004">
-    <w:abstractNumId w:val="991"/>
-  </w:num>
-  <w:num w:numId="1005">
     <w:abstractNumId w:val="991"/>
   </w:num>
 </w:numbering>

</xml_diff>